<commit_message>
Refine Fieldnotes W07 submission evidence
Co-authored-by: Copilot <223556219+Copilot@users.noreply.github.com>
</commit_message>
<xml_diff>
--- a/submission/Fieldnotes-W07-Skills-Development.docx
+++ b/submission/Fieldnotes-W07-Skills-Development.docx
@@ -42,7 +42,7 @@
     </w:p>
     <w:tbl>
       <w:tblPr>
-        <w:tblW w:w="9402" w:type="dxa"/>
+        <w:tblW w:w="9832" w:type="dxa"/>
         <w:jc w:val="start"/>
         <w:tblInd w:w="0" w:type="dxa"/>
         <w:tblLayout w:type="fixed"/>
@@ -54,14 +54,14 @@
         </w:tblCellMar>
       </w:tblPr>
       <w:tblGrid>
-        <w:gridCol w:w="2460"/>
-        <w:gridCol w:w="6942"/>
+        <w:gridCol w:w="2265"/>
+        <w:gridCol w:w="7567"/>
       </w:tblGrid>
       <w:tr>
         <w:trPr/>
         <w:tc>
           <w:tcPr>
-            <w:tcW w:w="2460" w:type="dxa"/>
+            <w:tcW w:w="2265" w:type="dxa"/>
             <w:tcBorders/>
             <w:vAlign w:val="center"/>
           </w:tcPr>
@@ -82,7 +82,7 @@
         </w:tc>
         <w:tc>
           <w:tcPr>
-            <w:tcW w:w="6942" w:type="dxa"/>
+            <w:tcW w:w="7567" w:type="dxa"/>
             <w:tcBorders/>
             <w:vAlign w:val="center"/>
           </w:tcPr>
@@ -105,7 +105,7 @@
         <w:trPr/>
         <w:tc>
           <w:tcPr>
-            <w:tcW w:w="2460" w:type="dxa"/>
+            <w:tcW w:w="2265" w:type="dxa"/>
             <w:tcBorders/>
             <w:vAlign w:val="center"/>
           </w:tcPr>
@@ -126,7 +126,7 @@
         </w:tc>
         <w:tc>
           <w:tcPr>
-            <w:tcW w:w="6942" w:type="dxa"/>
+            <w:tcW w:w="7567" w:type="dxa"/>
             <w:tcBorders/>
             <w:vAlign w:val="center"/>
           </w:tcPr>
@@ -153,7 +153,7 @@
         <w:trPr/>
         <w:tc>
           <w:tcPr>
-            <w:tcW w:w="2460" w:type="dxa"/>
+            <w:tcW w:w="2265" w:type="dxa"/>
             <w:tcBorders/>
             <w:vAlign w:val="center"/>
           </w:tcPr>
@@ -174,7 +174,7 @@
         </w:tc>
         <w:tc>
           <w:tcPr>
-            <w:tcW w:w="6942" w:type="dxa"/>
+            <w:tcW w:w="7567" w:type="dxa"/>
             <w:tcBorders/>
             <w:vAlign w:val="center"/>
           </w:tcPr>
@@ -201,7 +201,7 @@
         <w:trPr/>
         <w:tc>
           <w:tcPr>
-            <w:tcW w:w="2460" w:type="dxa"/>
+            <w:tcW w:w="2265" w:type="dxa"/>
             <w:tcBorders/>
             <w:vAlign w:val="center"/>
           </w:tcPr>
@@ -222,7 +222,7 @@
         </w:tc>
         <w:tc>
           <w:tcPr>
-            <w:tcW w:w="6942" w:type="dxa"/>
+            <w:tcW w:w="7567" w:type="dxa"/>
             <w:tcBorders/>
             <w:vAlign w:val="center"/>
           </w:tcPr>
@@ -249,7 +249,7 @@
         <w:trPr/>
         <w:tc>
           <w:tcPr>
-            <w:tcW w:w="2460" w:type="dxa"/>
+            <w:tcW w:w="2265" w:type="dxa"/>
             <w:tcBorders/>
             <w:vAlign w:val="center"/>
           </w:tcPr>
@@ -270,7 +270,7 @@
         </w:tc>
         <w:tc>
           <w:tcPr>
-            <w:tcW w:w="6942" w:type="dxa"/>
+            <w:tcW w:w="7567" w:type="dxa"/>
             <w:tcBorders/>
             <w:vAlign w:val="center"/>
           </w:tcPr>
@@ -286,11 +286,7 @@
               <w:rPr>
                 <w:rStyle w:val="Strong"/>
               </w:rPr>
-              <w:t>[ADD YOUR PUBLIC VIDEO URL BEFORE SUBMITTING]</w:t>
-            </w:r>
-            <w:r>
-              <w:rPr/>
-              <w:t xml:space="preserve"> </w:t>
+              <w:t xml:space="preserve">Public single-video URL not supplied. Add the direct video link here before submitting. </w:t>
             </w:r>
           </w:p>
         </w:tc>
@@ -318,7 +314,7 @@
           <w:bdr w:val="single" w:sz="24" w:space="11" w:color="D88A48"/>
           <w:shd w:fill="FFF3DF" w:val="clear"/>
         </w:rPr>
-        <w:t xml:space="preserve"> Record and publish an approximately five-minute screen walkthrough that shows your face at least at the beginning, demonstrates the running app, and explains the code examples below. Replace the video placeholder above with a public Loom, YouTube, or other hosted video link before uploading this document. The video has not been recorded or published as part of this document preparation. </w:t>
+        <w:t xml:space="preserve"> Record and publish an approximately five-minute screen walkthrough that shows your face at least at the beginning, demonstrates the running app, and explains the code examples below. Replace the pending-video note above with the publicly accessible URL for one individual video (not a Loom folder or collection) before uploading this document. The video has not been recorded or published as part of this document preparation. </w:t>
       </w:r>
     </w:p>
     <w:p>
@@ -352,30 +348,6 @@
       <w:r>
         <w:rPr/>
         <w:t xml:space="preserve">Fieldnotes is a responsive trip-planning experience for people preparing to spend time outdoors. A visitor can search for a place, review current conditions and a seven-day forecast, check air quality and daylight details, save places for later, and personalize temperature units and theme. The interface is populated from live Open-Meteo JSON responses. </w:t>
-      </w:r>
-    </w:p>
-    <w:p>
-      <w:pPr>
-        <w:pStyle w:val="BodyText"/>
-        <w:bidi w:val="0"/>
-        <w:spacing w:before="100" w:after="160"/>
-        <w:ind w:start="100" w:end="100"/>
-        <w:jc w:val="start"/>
-        <w:rPr/>
-      </w:pPr>
-      <w:r>
-        <w:rPr/>
-        <w:t xml:space="preserve">The application is published as a separate route in the course repository. The SleepOutside storefront remains at the repository root; Fieldnotes is served from </w:t>
-      </w:r>
-      <w:r>
-        <w:rPr>
-          <w:rStyle w:val="SourceText"/>
-        </w:rPr>
-        <w:t>/fieldnotes/</w:t>
-      </w:r>
-      <w:r>
-        <w:rPr/>
-        <w:t xml:space="preserve">. </w:t>
       </w:r>
     </w:p>
     <w:p>
@@ -411,8 +383,9 @@
         </w:tblCellMar>
       </w:tblPr>
       <w:tblGrid>
-        <w:gridCol w:w="1522"/>
-        <w:gridCol w:w="7299"/>
+        <w:gridCol w:w="1518"/>
+        <w:gridCol w:w="3668"/>
+        <w:gridCol w:w="3635"/>
         <w:gridCol w:w="1011"/>
       </w:tblGrid>
       <w:tr>
@@ -421,7 +394,7 @@
         </w:trPr>
         <w:tc>
           <w:tcPr>
-            <w:tcW w:w="1522" w:type="dxa"/>
+            <w:tcW w:w="1518" w:type="dxa"/>
             <w:tcBorders/>
             <w:vAlign w:val="center"/>
           </w:tcPr>
@@ -442,13 +415,34 @@
         </w:tc>
         <w:tc>
           <w:tcPr>
-            <w:tcW w:w="7299" w:type="dxa"/>
+            <w:tcW w:w="3668" w:type="dxa"/>
             <w:tcBorders/>
             <w:vAlign w:val="center"/>
           </w:tcPr>
           <w:p>
             <w:pPr>
               <w:pStyle w:val="TableHeading"/>
+              <w:suppressLineNumbers/>
+              <w:bidi w:val="0"/>
+              <w:spacing w:before="100" w:after="160"/>
+              <w:jc w:val="start"/>
+              <w:rPr/>
+            </w:pPr>
+            <w:r>
+              <w:rPr/>
+              <w:t>Where this can be seen in Fieldnotes</w:t>
+            </w:r>
+          </w:p>
+        </w:tc>
+        <w:tc>
+          <w:tcPr>
+            <w:tcW w:w="3635" w:type="dxa"/>
+            <w:tcBorders/>
+            <w:vAlign w:val="center"/>
+          </w:tcPr>
+          <w:p>
+            <w:pPr>
+              <w:pStyle w:val="TableHeading"/>
               <w:bidi w:val="0"/>
               <w:spacing w:before="100" w:after="160"/>
               <w:ind w:hanging="0" w:start="0" w:end="0"/>
@@ -457,7 +451,7 @@
             </w:pPr>
             <w:r>
               <w:rPr/>
-              <w:t>Fieldnotes implementation and evidence</w:t>
+              <w:t>Fieldnotes implementation</w:t>
             </w:r>
           </w:p>
         </w:tc>
@@ -486,7 +480,7 @@
         <w:trPr/>
         <w:tc>
           <w:tcPr>
-            <w:tcW w:w="1522" w:type="dxa"/>
+            <w:tcW w:w="1518" w:type="dxa"/>
             <w:tcBorders/>
             <w:vAlign w:val="center"/>
           </w:tcPr>
@@ -508,7 +502,27 @@
         </w:tc>
         <w:tc>
           <w:tcPr>
-            <w:tcW w:w="7299" w:type="dxa"/>
+            <w:tcW w:w="3668" w:type="dxa"/>
+            <w:tcBorders/>
+            <w:vAlign w:val="center"/>
+          </w:tcPr>
+          <w:p>
+            <w:pPr>
+              <w:pStyle w:val="TableContents"/>
+              <w:bidi w:val="0"/>
+              <w:spacing w:before="100" w:after="160"/>
+              <w:jc w:val="start"/>
+              <w:rPr/>
+            </w:pPr>
+            <w:r>
+              <w:rPr/>
+              <w:t xml:space="preserve">Search for a place and select a result: the current-conditions panel, seven-day cards, and condition cards update for that location. Save and reopen a place, refresh the forecast, and use the unit and theme controls. </w:t>
+            </w:r>
+          </w:p>
+        </w:tc>
+        <w:tc>
+          <w:tcPr>
+            <w:tcW w:w="3635" w:type="dxa"/>
             <w:tcBorders/>
             <w:vAlign w:val="center"/>
           </w:tcPr>
@@ -522,14 +536,8 @@
               <w:rPr/>
             </w:pPr>
             <w:r>
-              <w:rPr>
-                <w:rStyle w:val="SourceText"/>
-              </w:rPr>
-              <w:t>app.js</w:t>
-            </w:r>
-            <w:r>
-              <w:rPr/>
-              <w:t xml:space="preserve"> manages app state, validates search input, handles asynchronous place and weather requests, prevents stale responses from replacing newer results, converts units, and dynamically creates the forecast, condition, search-result, and saved-place interfaces from returned data. Errors and optional air-quality availability have user-visible handling. </w:t>
+              <w:rPr/>
+              <w:t xml:space="preserve">JavaScript validates searches, handles asynchronous API integration/data-layer responses, guards against stale responses, converts values, and dynamically renders interface cards and accessible loading/error states. </w:t>
             </w:r>
           </w:p>
         </w:tc>
@@ -558,7 +566,7 @@
         <w:trPr/>
         <w:tc>
           <w:tcPr>
-            <w:tcW w:w="1522" w:type="dxa"/>
+            <w:tcW w:w="1518" w:type="dxa"/>
             <w:tcBorders/>
             <w:vAlign w:val="center"/>
           </w:tcPr>
@@ -580,7 +588,27 @@
         </w:tc>
         <w:tc>
           <w:tcPr>
-            <w:tcW w:w="7299" w:type="dxa"/>
+            <w:tcW w:w="3668" w:type="dxa"/>
+            <w:tcBorders/>
+            <w:vAlign w:val="center"/>
+          </w:tcPr>
+          <w:p>
+            <w:pPr>
+              <w:pStyle w:val="TableContents"/>
+              <w:bidi w:val="0"/>
+              <w:spacing w:before="100" w:after="160"/>
+              <w:jc w:val="start"/>
+              <w:rPr/>
+            </w:pPr>
+            <w:r>
+              <w:rPr/>
+              <w:t xml:space="preserve">Use the location search, open a forecast, then inspect the air quality card in the “Know before you go” section. </w:t>
+            </w:r>
+          </w:p>
+        </w:tc>
+        <w:tc>
+          <w:tcPr>
+            <w:tcW w:w="3635" w:type="dxa"/>
             <w:tcBorders/>
             <w:vAlign w:val="center"/>
           </w:tcPr>
@@ -594,44 +622,8 @@
               <w:rPr/>
             </w:pPr>
             <w:r>
-              <w:rPr>
-                <w:rStyle w:val="SourceText"/>
-              </w:rPr>
-              <w:t>api.js</w:t>
-            </w:r>
-            <w:r>
-              <w:rPr/>
-              <w:t xml:space="preserve"> uses three Open-Meteo endpoints: Geocoding (</w:t>
-            </w:r>
-            <w:r>
-              <w:rPr>
-                <w:rStyle w:val="SourceText"/>
-              </w:rPr>
-              <w:t>geocoding-api.open-meteo.com/v1/search</w:t>
-            </w:r>
-            <w:r>
-              <w:rPr/>
-              <w:t>), weather Forecast (</w:t>
-            </w:r>
-            <w:r>
-              <w:rPr>
-                <w:rStyle w:val="SourceText"/>
-              </w:rPr>
-              <w:t>api.open-meteo.com/v1/forecast</w:t>
-            </w:r>
-            <w:r>
-              <w:rPr/>
-              <w:t>), and Air Quality (</w:t>
-            </w:r>
-            <w:r>
-              <w:rPr>
-                <w:rStyle w:val="SourceText"/>
-              </w:rPr>
-              <w:t>air-quality-api.open-meteo.com/v1/air-quality</w:t>
-            </w:r>
-            <w:r>
-              <w:rPr/>
-              <w:t xml:space="preserve">). Forecast and air-quality requests run concurrently; air quality is optional if that endpoint is unavailable. </w:t>
+              <w:rPr/>
+              <w:t xml:space="preserve">Open-Meteo Geocoding finds locations, Forecast supplies current and daily conditions, and Air Quality supplies AQI data. Forecast and air-quality requests run concurrently; the forecast remains usable when air quality is unavailable. </w:t>
             </w:r>
           </w:p>
         </w:tc>
@@ -660,7 +652,7 @@
         <w:trPr/>
         <w:tc>
           <w:tcPr>
-            <w:tcW w:w="1522" w:type="dxa"/>
+            <w:tcW w:w="1518" w:type="dxa"/>
             <w:tcBorders/>
             <w:vAlign w:val="center"/>
           </w:tcPr>
@@ -682,7 +674,27 @@
         </w:tc>
         <w:tc>
           <w:tcPr>
-            <w:tcW w:w="7299" w:type="dxa"/>
+            <w:tcW w:w="3668" w:type="dxa"/>
+            <w:tcBorders/>
+            <w:vAlign w:val="center"/>
+          </w:tcPr>
+          <w:p>
+            <w:pPr>
+              <w:pStyle w:val="TableContents"/>
+              <w:bidi w:val="0"/>
+              <w:spacing w:before="100" w:after="160"/>
+              <w:jc w:val="start"/>
+              <w:rPr/>
+            </w:pPr>
+            <w:r>
+              <w:rPr/>
+              <w:t xml:space="preserve">Search results appear below the search box; selecting a place populates the seven-day forecast and the sunrise, AQI, UV, and daylight cards with live values. </w:t>
+            </w:r>
+          </w:p>
+        </w:tc>
+        <w:tc>
+          <w:tcPr>
+            <w:tcW w:w="3635" w:type="dxa"/>
             <w:tcBorders/>
             <w:vAlign w:val="center"/>
           </w:tcPr>
@@ -697,7 +709,7 @@
             </w:pPr>
             <w:r>
               <w:rPr/>
-              <w:t xml:space="preserve">Geocoding returns an array of matching place objects. Forecast responses provide current conditions and parallel daily arrays, including date, weather code, maximum/minimum temperature, precipitation probability, sunrise, sunset, UV index, and maximum wind speed. JavaScript maps daily entries into seven visible forecast cards and uses the response to create conditions cards. </w:t>
+              <w:t xml:space="preserve">Arrays of geocoding results and forecast daily data (dates, weather codes, temperatures, precipitation probabilities, sunrise, sunset, UV, and wind speed) are used to create the visible interface. </w:t>
             </w:r>
           </w:p>
         </w:tc>
@@ -726,7 +738,7 @@
         <w:trPr/>
         <w:tc>
           <w:tcPr>
-            <w:tcW w:w="1522" w:type="dxa"/>
+            <w:tcW w:w="1518" w:type="dxa"/>
             <w:tcBorders/>
             <w:vAlign w:val="center"/>
           </w:tcPr>
@@ -748,7 +760,27 @@
         </w:tc>
         <w:tc>
           <w:tcPr>
-            <w:tcW w:w="7299" w:type="dxa"/>
+            <w:tcW w:w="3668" w:type="dxa"/>
+            <w:tcBorders/>
+            <w:vAlign w:val="center"/>
+          </w:tcPr>
+          <w:p>
+            <w:pPr>
+              <w:pStyle w:val="TableContents"/>
+              <w:bidi w:val="0"/>
+              <w:spacing w:before="100" w:after="160"/>
+              <w:jc w:val="start"/>
+              <w:rPr/>
+            </w:pPr>
+            <w:r>
+              <w:rPr/>
+              <w:t xml:space="preserve">Resize the browser to see the forecast and condition-card layout adapt. Hover or focus interactive controls and cards, switch the theme, and observe loading/entrance effects. </w:t>
+            </w:r>
+          </w:p>
+        </w:tc>
+        <w:tc>
+          <w:tcPr>
+            <w:tcW w:w="3635" w:type="dxa"/>
             <w:tcBorders/>
             <w:vAlign w:val="center"/>
           </w:tcPr>
@@ -762,14 +794,8 @@
               <w:rPr/>
             </w:pPr>
             <w:r>
-              <w:rPr>
-                <w:rStyle w:val="SourceText"/>
-              </w:rPr>
-              <w:t>styles.css</w:t>
-            </w:r>
-            <w:r>
-              <w:rPr/>
-              <w:t xml:space="preserve"> provides responsive layouts, light/dark theme tokens, interactive hover/focus treatments and transitions, animated loading and entrance states, and reduced-motion support. These effects appear across controls, cards, loading, and content reveal states. </w:t>
+              <w:rPr/>
+              <w:t xml:space="preserve">Responsive CSS, light/dark theme variables, hover/focus transitions, keyframe animations, and reduced-motion support style the Fieldnotes interface. </w:t>
             </w:r>
           </w:p>
         </w:tc>
@@ -798,7 +824,7 @@
         <w:trPr/>
         <w:tc>
           <w:tcPr>
-            <w:tcW w:w="1522" w:type="dxa"/>
+            <w:tcW w:w="1518" w:type="dxa"/>
             <w:tcBorders/>
             <w:vAlign w:val="center"/>
           </w:tcPr>
@@ -820,7 +846,27 @@
         </w:tc>
         <w:tc>
           <w:tcPr>
-            <w:tcW w:w="7299" w:type="dxa"/>
+            <w:tcW w:w="3668" w:type="dxa"/>
+            <w:tcBorders/>
+            <w:vAlign w:val="center"/>
+          </w:tcPr>
+          <w:p>
+            <w:pPr>
+              <w:pStyle w:val="TableContents"/>
+              <w:bidi w:val="0"/>
+              <w:spacing w:before="100" w:after="160"/>
+              <w:jc w:val="start"/>
+              <w:rPr/>
+            </w:pPr>
+            <w:r>
+              <w:rPr/>
+              <w:t xml:space="preserve">Submit a place search, select a result, save/remove and reopen a place, switch units and theme, refresh, or press Escape while results are open. </w:t>
+            </w:r>
+          </w:p>
+        </w:tc>
+        <w:tc>
+          <w:tcPr>
+            <w:tcW w:w="3635" w:type="dxa"/>
             <w:tcBorders/>
             <w:vAlign w:val="center"/>
           </w:tcPr>
@@ -835,7 +881,7 @@
             </w:pPr>
             <w:r>
               <w:rPr/>
-              <w:t xml:space="preserve">The app responds to search form submission, search input changes, Escape key presses in the input/results, selecting a search result, save/remove actions, saved-place selection, unit toggle, theme toggle, refresh, and clicks outside the search form. </w:t>
+              <w:t xml:space="preserve">Form submit, input, keyboard, selection, save/remove, unit, theme, refresh, and outside-click handlers update the application responsively. </w:t>
             </w:r>
           </w:p>
         </w:tc>
@@ -864,7 +910,7 @@
         <w:trPr/>
         <w:tc>
           <w:tcPr>
-            <w:tcW w:w="1522" w:type="dxa"/>
+            <w:tcW w:w="1518" w:type="dxa"/>
             <w:tcBorders/>
             <w:vAlign w:val="center"/>
           </w:tcPr>
@@ -886,7 +932,27 @@
         </w:tc>
         <w:tc>
           <w:tcPr>
-            <w:tcW w:w="7299" w:type="dxa"/>
+            <w:tcW w:w="3668" w:type="dxa"/>
+            <w:tcBorders/>
+            <w:vAlign w:val="center"/>
+          </w:tcPr>
+          <w:p>
+            <w:pPr>
+              <w:pStyle w:val="TableContents"/>
+              <w:bidi w:val="0"/>
+              <w:spacing w:before="100" w:after="160"/>
+              <w:jc w:val="start"/>
+              <w:rPr/>
+            </w:pPr>
+            <w:r>
+              <w:rPr/>
+              <w:t xml:space="preserve">Save a location, change units/theme, and reload the page. The saved place and preferences are restored. </w:t>
+            </w:r>
+          </w:p>
+        </w:tc>
+        <w:tc>
+          <w:tcPr>
+            <w:tcW w:w="3635" w:type="dxa"/>
             <w:tcBorders/>
             <w:vAlign w:val="center"/>
           </w:tcPr>
@@ -901,17 +967,7 @@
             </w:pPr>
             <w:r>
               <w:rPr/>
-              <w:t xml:space="preserve">The </w:t>
-            </w:r>
-            <w:r>
-              <w:rPr>
-                <w:rStyle w:val="SourceText"/>
-              </w:rPr>
-              <w:t>fieldnotes-preferences</w:t>
-            </w:r>
-            <w:r>
-              <w:rPr/>
-              <w:t xml:space="preserve"> object persists four properties: </w:t>
+              <w:t xml:space="preserve">Four properties are stored and restored: </w:t>
             </w:r>
             <w:r>
               <w:rPr>
@@ -951,7 +1007,7 @@
             </w:r>
             <w:r>
               <w:rPr/>
-              <w:t xml:space="preserve">. They restore the visitor's saved settings and shortlist on reload. </w:t>
+              <w:t xml:space="preserve">. Invalid stored JSON is handled safely. </w:t>
             </w:r>
           </w:p>
         </w:tc>
@@ -980,7 +1036,7 @@
         <w:trPr/>
         <w:tc>
           <w:tcPr>
-            <w:tcW w:w="1522" w:type="dxa"/>
+            <w:tcW w:w="1518" w:type="dxa"/>
             <w:tcBorders/>
             <w:vAlign w:val="center"/>
           </w:tcPr>
@@ -1002,7 +1058,27 @@
         </w:tc>
         <w:tc>
           <w:tcPr>
-            <w:tcW w:w="7299" w:type="dxa"/>
+            <w:tcW w:w="3668" w:type="dxa"/>
+            <w:tcBorders/>
+            <w:vAlign w:val="center"/>
+          </w:tcPr>
+          <w:p>
+            <w:pPr>
+              <w:pStyle w:val="TableContents"/>
+              <w:bidi w:val="0"/>
+              <w:spacing w:before="100" w:after="160"/>
+              <w:jc w:val="start"/>
+              <w:rPr/>
+            </w:pPr>
+            <w:r>
+              <w:rPr/>
+              <w:t xml:space="preserve">Open the public Fieldnotes Trello board and inspect its Completed list. Each finished card is marked complete and includes a description with links to the implementation and live app. </w:t>
+            </w:r>
+          </w:p>
+        </w:tc>
+        <w:tc>
+          <w:tcPr>
+            <w:tcW w:w="3635" w:type="dxa"/>
             <w:tcBorders/>
             <w:vAlign w:val="center"/>
           </w:tcPr>
@@ -1017,7 +1093,7 @@
             </w:pPr>
             <w:r>
               <w:rPr/>
-              <w:t xml:space="preserve">Trello visibility is set to Public. Six finished project tasks are in the Completed list and individually marked complete; each card includes a summary with links to implementation evidence and the live app. Direct links are listed below. </w:t>
+              <w:t xml:space="preserve">The board records project progress and evidence for the Fieldnotes application. </w:t>
             </w:r>
           </w:p>
         </w:tc>
@@ -1046,7 +1122,7 @@
         <w:trPr/>
         <w:tc>
           <w:tcPr>
-            <w:tcW w:w="1522" w:type="dxa"/>
+            <w:tcW w:w="1518" w:type="dxa"/>
             <w:tcBorders/>
             <w:vAlign w:val="center"/>
           </w:tcPr>
@@ -1068,7 +1144,27 @@
         </w:tc>
         <w:tc>
           <w:tcPr>
-            <w:tcW w:w="7299" w:type="dxa"/>
+            <w:tcW w:w="3668" w:type="dxa"/>
+            <w:tcBorders/>
+            <w:vAlign w:val="center"/>
+          </w:tcPr>
+          <w:p>
+            <w:pPr>
+              <w:pStyle w:val="TableContents"/>
+              <w:bidi w:val="0"/>
+              <w:spacing w:before="100" w:after="160"/>
+              <w:jc w:val="start"/>
+              <w:rPr/>
+            </w:pPr>
+            <w:r>
+              <w:rPr/>
+              <w:t xml:space="preserve">One public, approximately five-minute video URL is still required. The recording should show your face at the beginning, demonstrate Fieldnotes in the browser, and explain its code. </w:t>
+            </w:r>
+          </w:p>
+        </w:tc>
+        <w:tc>
+          <w:tcPr>
+            <w:tcW w:w="3635" w:type="dxa"/>
             <w:tcBorders/>
             <w:vAlign w:val="center"/>
           </w:tcPr>
@@ -1083,7 +1179,7 @@
             </w:pPr>
             <w:r>
               <w:rPr/>
-              <w:t xml:space="preserve">Not yet supplied. This criterion requires the student's own public recording (approximately five minutes, face visible at least at the beginning, with application and code demonstration). </w:t>
+              <w:t xml:space="preserve">Not yet supplied. Record and publish one video, add its direct video URL, and test it in a private browser window. </w:t>
             </w:r>
           </w:p>
         </w:tc>
@@ -1138,17 +1234,7 @@
       </w:pPr>
       <w:r>
         <w:rPr/>
-        <w:t xml:space="preserve">The board menu reports </w:t>
-      </w:r>
-      <w:r>
-        <w:rPr>
-          <w:rStyle w:val="Strong"/>
-        </w:rPr>
-        <w:t>Visibility: Public</w:t>
-      </w:r>
-      <w:r>
-        <w:rPr/>
-        <w:t xml:space="preserve">. The following completed cards show the finished task, its evidence description, and the Trello completion state: </w:t>
+        <w:t xml:space="preserve">The board is public. The following completed cards show the finished task, its evidence description, and the Trello completion state: </w:t>
       </w:r>
     </w:p>
     <w:p>
@@ -1358,8 +1444,8 @@
         </w:tblCellMar>
       </w:tblPr>
       <w:tblGrid>
-        <w:gridCol w:w="2132"/>
-        <w:gridCol w:w="7700"/>
+        <w:gridCol w:w="2035"/>
+        <w:gridCol w:w="7797"/>
       </w:tblGrid>
       <w:tr>
         <w:trPr>
@@ -1367,7 +1453,7 @@
         </w:trPr>
         <w:tc>
           <w:tcPr>
-            <w:tcW w:w="2132" w:type="dxa"/>
+            <w:tcW w:w="2035" w:type="dxa"/>
             <w:tcBorders/>
             <w:vAlign w:val="center"/>
           </w:tcPr>
@@ -1388,7 +1474,7 @@
         </w:tc>
         <w:tc>
           <w:tcPr>
-            <w:tcW w:w="7700" w:type="dxa"/>
+            <w:tcW w:w="7797" w:type="dxa"/>
             <w:tcBorders/>
             <w:vAlign w:val="center"/>
           </w:tcPr>
@@ -1412,7 +1498,7 @@
         <w:trPr/>
         <w:tc>
           <w:tcPr>
-            <w:tcW w:w="2132" w:type="dxa"/>
+            <w:tcW w:w="2035" w:type="dxa"/>
             <w:tcBorders/>
             <w:vAlign w:val="center"/>
           </w:tcPr>
@@ -1443,21 +1529,31 @@
         </w:tc>
         <w:tc>
           <w:tcPr>
-            <w:tcW w:w="7700" w:type="dxa"/>
-            <w:tcBorders/>
-            <w:vAlign w:val="center"/>
-          </w:tcPr>
-          <w:p>
-            <w:pPr>
-              <w:pStyle w:val="TableContents"/>
-              <w:bidi w:val="0"/>
-              <w:spacing w:before="100" w:after="160"/>
-              <w:jc w:val="start"/>
-              <w:rPr/>
-            </w:pPr>
-            <w:r>
-              <w:rPr/>
-              <w:t xml:space="preserve">URL construction and query parameters; JSON retrieval and HTTP errors; parallel forecast/air-quality requests; validation of required forecast response data. </w:t>
+            <w:tcW w:w="7797" w:type="dxa"/>
+            <w:tcBorders/>
+            <w:vAlign w:val="center"/>
+          </w:tcPr>
+          <w:p>
+            <w:pPr>
+              <w:pStyle w:val="TableContents"/>
+              <w:bidi w:val="0"/>
+              <w:spacing w:before="100" w:after="160"/>
+              <w:jc w:val="start"/>
+              <w:rPr/>
+            </w:pPr>
+            <w:r>
+              <w:rPr/>
+              <w:t xml:space="preserve">URL construction and query parameters; JSON retrieval and HTTP errors; </w:t>
+            </w:r>
+            <w:r>
+              <w:rPr>
+                <w:rStyle w:val="SourceText"/>
+              </w:rPr>
+              <w:t>Promise.allSettled</w:t>
+            </w:r>
+            <w:r>
+              <w:rPr/>
+              <w:t xml:space="preserve"> for parallel forecast/air-quality requests; validation of required forecast response data. </w:t>
             </w:r>
           </w:p>
         </w:tc>
@@ -1466,7 +1562,7 @@
         <w:trPr/>
         <w:tc>
           <w:tcPr>
-            <w:tcW w:w="2132" w:type="dxa"/>
+            <w:tcW w:w="2035" w:type="dxa"/>
             <w:tcBorders/>
             <w:vAlign w:val="center"/>
           </w:tcPr>
@@ -1497,21 +1593,31 @@
         </w:tc>
         <w:tc>
           <w:tcPr>
-            <w:tcW w:w="7700" w:type="dxa"/>
-            <w:tcBorders/>
-            <w:vAlign w:val="center"/>
-          </w:tcPr>
-          <w:p>
-            <w:pPr>
-              <w:pStyle w:val="TableContents"/>
-              <w:bidi w:val="0"/>
-              <w:spacing w:before="100" w:after="160"/>
-              <w:jc w:val="start"/>
-              <w:rPr/>
-            </w:pPr>
-            <w:r>
-              <w:rPr/>
-              <w:t xml:space="preserve">State and persisted preferences; accessible status messages; rendering seven daily cards from API arrays; derived daylight and AQI guidance; save/remove; request sequencing; event listeners. </w:t>
+            <w:tcW w:w="7797" w:type="dxa"/>
+            <w:tcBorders/>
+            <w:vAlign w:val="center"/>
+          </w:tcPr>
+          <w:p>
+            <w:pPr>
+              <w:pStyle w:val="TableContents"/>
+              <w:bidi w:val="0"/>
+              <w:spacing w:before="100" w:after="160"/>
+              <w:jc w:val="start"/>
+              <w:rPr/>
+            </w:pPr>
+            <w:r>
+              <w:rPr/>
+              <w:t xml:space="preserve">State and persisted preferences; accessible status messages; rendering seven daily cards from API arrays; derived daylight and AQI guidance; save/remove; request sequencing through </w:t>
+            </w:r>
+            <w:r>
+              <w:rPr>
+                <w:rStyle w:val="SourceText"/>
+              </w:rPr>
+              <w:t>requestId</w:t>
+            </w:r>
+            <w:r>
+              <w:rPr/>
+              <w:t xml:space="preserve">; event listeners. </w:t>
             </w:r>
           </w:p>
         </w:tc>
@@ -1520,7 +1626,7 @@
         <w:trPr/>
         <w:tc>
           <w:tcPr>
-            <w:tcW w:w="2132" w:type="dxa"/>
+            <w:tcW w:w="2035" w:type="dxa"/>
             <w:tcBorders/>
             <w:vAlign w:val="center"/>
           </w:tcPr>
@@ -1551,7 +1657,7 @@
         </w:tc>
         <w:tc>
           <w:tcPr>
-            <w:tcW w:w="7700" w:type="dxa"/>
+            <w:tcW w:w="7797" w:type="dxa"/>
             <w:tcBorders/>
             <w:vAlign w:val="center"/>
           </w:tcPr>
@@ -1574,7 +1680,7 @@
         <w:trPr/>
         <w:tc>
           <w:tcPr>
-            <w:tcW w:w="2132" w:type="dxa"/>
+            <w:tcW w:w="2035" w:type="dxa"/>
             <w:tcBorders/>
             <w:vAlign w:val="center"/>
           </w:tcPr>
@@ -1605,7 +1711,7 @@
         </w:tc>
         <w:tc>
           <w:tcPr>
-            <w:tcW w:w="7700" w:type="dxa"/>
+            <w:tcW w:w="7797" w:type="dxa"/>
             <w:tcBorders/>
             <w:vAlign w:val="center"/>
           </w:tcPr>
@@ -1707,7 +1813,7 @@
       </w:pPr>
       <w:r>
         <w:rPr/>
-        <w:t xml:space="preserve">Saving a place, switching from Celsius to Fahrenheit, enabling dark theme, and reloading restored the saved place and preferences. </w:t>
+        <w:t xml:space="preserve">Saving a place, switching from Celsius to Fahrenheit, enabling dark theme, and reloading restored the saved place and preferences. Wind speed follows the selected unit: km/h in Celsius and mph in Fahrenheit. </w:t>
       </w:r>
     </w:p>
     <w:p>
@@ -1736,34 +1842,6 @@
       <w:r>
         <w:rPr/>
         <w:t xml:space="preserve"> completed successfully. </w:t>
-      </w:r>
-    </w:p>
-    <w:p>
-      <w:pPr>
-        <w:pStyle w:val="BodyText"/>
-        <w:numPr>
-          <w:ilvl w:val="0"/>
-          <w:numId w:val="3"/>
-        </w:numPr>
-        <w:tabs>
-          <w:tab w:val="clear" w:pos="1134"/>
-          <w:tab w:val="left" w:pos="809" w:leader="none"/>
-        </w:tabs>
-        <w:bidi w:val="0"/>
-        <w:spacing w:before="100" w:after="0"/>
-        <w:ind w:hanging="283" w:start="809"/>
-        <w:jc w:val="start"/>
-        <w:rPr/>
-      </w:pPr>
-      <w:r>
-        <w:rPr>
-          <w:rStyle w:val="SourceText"/>
-        </w:rPr>
-        <w:t>npm test</w:t>
-      </w:r>
-      <w:r>
-        <w:rPr/>
-        <w:t xml:space="preserve"> passed all 8 existing tests. </w:t>
       </w:r>
     </w:p>
     <w:p>
@@ -1843,7 +1921,21 @@
       </w:pPr>
       <w:r>
         <w:rPr/>
-        <w:t>Five-minute video run-through</w:t>
+        <w:t>Five-minute video script and run-through</w:t>
+      </w:r>
+    </w:p>
+    <w:p>
+      <w:pPr>
+        <w:pStyle w:val="BodyText"/>
+        <w:bidi w:val="0"/>
+        <w:spacing w:before="100" w:after="160"/>
+        <w:ind w:start="100" w:end="100"/>
+        <w:jc w:val="start"/>
+        <w:rPr/>
+      </w:pPr>
+      <w:r>
+        <w:rPr/>
+        <w:t xml:space="preserve">Use this as a spoken outline rather than reading mechanically. Keep your face visible during the introduction, share your screen for the demonstration, and use the code sections to explain the named logic. </w:t>
       </w:r>
     </w:p>
     <w:tbl>
@@ -1860,8 +1952,8 @@
         </w:tblCellMar>
       </w:tblPr>
       <w:tblGrid>
-        <w:gridCol w:w="882"/>
-        <w:gridCol w:w="8950"/>
+        <w:gridCol w:w="671"/>
+        <w:gridCol w:w="9161"/>
       </w:tblGrid>
       <w:tr>
         <w:trPr>
@@ -1869,7 +1961,7 @@
         </w:trPr>
         <w:tc>
           <w:tcPr>
-            <w:tcW w:w="882" w:type="dxa"/>
+            <w:tcW w:w="671" w:type="dxa"/>
             <w:tcBorders/>
             <w:vAlign w:val="center"/>
           </w:tcPr>
@@ -1890,7 +1982,7 @@
         </w:tc>
         <w:tc>
           <w:tcPr>
-            <w:tcW w:w="8950" w:type="dxa"/>
+            <w:tcW w:w="9161" w:type="dxa"/>
             <w:tcBorders/>
             <w:vAlign w:val="center"/>
           </w:tcPr>
@@ -1905,7 +1997,7 @@
             </w:pPr>
             <w:r>
               <w:rPr/>
-              <w:t>Recording plan</w:t>
+              <w:t>On screen and spoken script</w:t>
             </w:r>
           </w:p>
         </w:tc>
@@ -1914,7 +2006,7 @@
         <w:trPr/>
         <w:tc>
           <w:tcPr>
-            <w:tcW w:w="882" w:type="dxa"/>
+            <w:tcW w:w="671" w:type="dxa"/>
             <w:tcBorders/>
             <w:vAlign w:val="center"/>
           </w:tcPr>
@@ -1934,21 +2026,27 @@
         </w:tc>
         <w:tc>
           <w:tcPr>
-            <w:tcW w:w="8950" w:type="dxa"/>
-            <w:tcBorders/>
-            <w:vAlign w:val="center"/>
-          </w:tcPr>
-          <w:p>
-            <w:pPr>
-              <w:pStyle w:val="TableContents"/>
-              <w:bidi w:val="0"/>
-              <w:spacing w:before="100" w:after="160"/>
-              <w:jc w:val="start"/>
-              <w:rPr/>
-            </w:pPr>
-            <w:r>
-              <w:rPr/>
-              <w:t xml:space="preserve">Show your face, introduce yourself and Fieldnotes, and state the purpose of the application. </w:t>
+            <w:tcW w:w="9161" w:type="dxa"/>
+            <w:tcBorders/>
+            <w:vAlign w:val="center"/>
+          </w:tcPr>
+          <w:p>
+            <w:pPr>
+              <w:pStyle w:val="TableContents"/>
+              <w:bidi w:val="0"/>
+              <w:spacing w:before="100" w:after="160"/>
+              <w:jc w:val="start"/>
+              <w:rPr/>
+            </w:pPr>
+            <w:r>
+              <w:rPr>
+                <w:rStyle w:val="Strong"/>
+              </w:rPr>
+              <w:t>Camera on; introduce the project.</w:t>
+            </w:r>
+            <w:r>
+              <w:rPr/>
+              <w:t xml:space="preserve"> “Hello, my name is Ronald Ongom, and this is my WDD 330 final project, Fieldnotes. It helps people check weather and outdoor conditions before visiting a place. I’ll demonstrate the live application and explain how its API integration, JavaScript, and CSS make it work.” </w:t>
             </w:r>
           </w:p>
         </w:tc>
@@ -1957,7 +2055,7 @@
         <w:trPr/>
         <w:tc>
           <w:tcPr>
-            <w:tcW w:w="882" w:type="dxa"/>
+            <w:tcW w:w="671" w:type="dxa"/>
             <w:tcBorders/>
             <w:vAlign w:val="center"/>
           </w:tcPr>
@@ -1977,21 +2075,27 @@
         </w:tc>
         <w:tc>
           <w:tcPr>
-            <w:tcW w:w="8950" w:type="dxa"/>
-            <w:tcBorders/>
-            <w:vAlign w:val="center"/>
-          </w:tcPr>
-          <w:p>
-            <w:pPr>
-              <w:pStyle w:val="TableContents"/>
-              <w:bidi w:val="0"/>
-              <w:spacing w:before="100" w:after="160"/>
-              <w:jc w:val="start"/>
-              <w:rPr/>
-            </w:pPr>
-            <w:r>
-              <w:rPr/>
-              <w:t xml:space="preserve">In the browser, search for a location, select a result, and explain the current conditions, seven-day forecast, AQI, UV, sunrise, and daylight cards. </w:t>
+            <w:tcW w:w="9161" w:type="dxa"/>
+            <w:tcBorders/>
+            <w:vAlign w:val="center"/>
+          </w:tcPr>
+          <w:p>
+            <w:pPr>
+              <w:pStyle w:val="TableContents"/>
+              <w:bidi w:val="0"/>
+              <w:spacing w:before="100" w:after="160"/>
+              <w:jc w:val="start"/>
+              <w:rPr/>
+            </w:pPr>
+            <w:r>
+              <w:rPr>
+                <w:rStyle w:val="Strong"/>
+              </w:rPr>
+              <w:t>Show the live app; search for Zion National Park.</w:t>
+            </w:r>
+            <w:r>
+              <w:rPr/>
+              <w:t xml:space="preserve"> “I’ll search for Zion National Park and select the matching place. The current-conditions card and seven-day forecast now show data for this location. Each day includes its weather, high and low temperatures, and chance of rain. In ‘Know before you go,’ Fieldnotes also displays sunrise, air quality, UV index, and daylight duration. These values come from API responses, so searching for another place updates the forecast. If air quality is unavailable, the weather forecast can still load.” </w:t>
             </w:r>
           </w:p>
         </w:tc>
@@ -2000,7 +2104,7 @@
         <w:trPr/>
         <w:tc>
           <w:tcPr>
-            <w:tcW w:w="882" w:type="dxa"/>
+            <w:tcW w:w="671" w:type="dxa"/>
             <w:tcBorders/>
             <w:vAlign w:val="center"/>
           </w:tcPr>
@@ -2020,21 +2124,27 @@
         </w:tc>
         <w:tc>
           <w:tcPr>
-            <w:tcW w:w="8950" w:type="dxa"/>
-            <w:tcBorders/>
-            <w:vAlign w:val="center"/>
-          </w:tcPr>
-          <w:p>
-            <w:pPr>
-              <w:pStyle w:val="TableContents"/>
-              <w:bidi w:val="0"/>
-              <w:spacing w:before="100" w:after="160"/>
-              <w:jc w:val="start"/>
-              <w:rPr/>
-            </w:pPr>
-            <w:r>
-              <w:rPr/>
-              <w:t xml:space="preserve">Save the selected place, change temperature units and theme, refresh the forecast, and show saved-place persistence after reload. </w:t>
+            <w:tcW w:w="9161" w:type="dxa"/>
+            <w:tcBorders/>
+            <w:vAlign w:val="center"/>
+          </w:tcPr>
+          <w:p>
+            <w:pPr>
+              <w:pStyle w:val="TableContents"/>
+              <w:bidi w:val="0"/>
+              <w:spacing w:before="100" w:after="160"/>
+              <w:jc w:val="start"/>
+              <w:rPr/>
+            </w:pPr>
+            <w:r>
+              <w:rPr>
+                <w:rStyle w:val="Strong"/>
+              </w:rPr>
+              <w:t>Show the interactions and localStorage behavior.</w:t>
+            </w:r>
+            <w:r>
+              <w:rPr/>
+              <w:t xml:space="preserve"> “I can save this place with the star and return to it from my shortlist. I can switch from Celsius to Fahrenheit; the wind display changes from kilometres per hour to miles per hour along with the temperature display. I can also switch the color theme and refresh the forecast. The saved place, selected unit, theme, and last viewed place are stored in this browser. After reload, those preferences are restored.” </w:t>
             </w:r>
           </w:p>
         </w:tc>
@@ -2043,61 +2153,79 @@
         <w:trPr/>
         <w:tc>
           <w:tcPr>
-            <w:tcW w:w="882" w:type="dxa"/>
-            <w:tcBorders/>
-            <w:vAlign w:val="center"/>
-          </w:tcPr>
-          <w:p>
-            <w:pPr>
-              <w:pStyle w:val="TableContents"/>
-              <w:bidi w:val="0"/>
-              <w:spacing w:before="100" w:after="160"/>
-              <w:jc w:val="start"/>
-              <w:rPr/>
-            </w:pPr>
-            <w:r>
-              <w:rPr/>
-              <w:t>2:40–4:25</w:t>
-            </w:r>
-          </w:p>
-        </w:tc>
-        <w:tc>
-          <w:tcPr>
-            <w:tcW w:w="8950" w:type="dxa"/>
-            <w:tcBorders/>
-            <w:vAlign w:val="center"/>
-          </w:tcPr>
-          <w:p>
-            <w:pPr>
-              <w:pStyle w:val="TableContents"/>
-              <w:bidi w:val="0"/>
-              <w:spacing w:before="100" w:after="160"/>
-              <w:jc w:val="start"/>
-              <w:rPr/>
-            </w:pPr>
-            <w:r>
-              <w:rPr/>
+            <w:tcW w:w="671" w:type="dxa"/>
+            <w:tcBorders/>
+            <w:vAlign w:val="center"/>
+          </w:tcPr>
+          <w:p>
+            <w:pPr>
+              <w:pStyle w:val="TableContents"/>
+              <w:bidi w:val="0"/>
+              <w:spacing w:before="100" w:after="160"/>
+              <w:jc w:val="start"/>
+              <w:rPr/>
+            </w:pPr>
+            <w:r>
+              <w:rPr/>
+              <w:t>2:40–3:30</w:t>
+            </w:r>
+          </w:p>
+        </w:tc>
+        <w:tc>
+          <w:tcPr>
+            <w:tcW w:w="9161" w:type="dxa"/>
+            <w:tcBorders/>
+            <w:vAlign w:val="center"/>
+          </w:tcPr>
+          <w:p>
+            <w:pPr>
+              <w:pStyle w:val="TableContents"/>
+              <w:bidi w:val="0"/>
+              <w:spacing w:before="100" w:after="160"/>
+              <w:jc w:val="start"/>
+              <w:rPr/>
+            </w:pPr>
+            <w:r>
+              <w:rPr>
+                <w:rStyle w:val="Strong"/>
+              </w:rPr>
               <w:t xml:space="preserve">Show </w:t>
             </w:r>
             <w:r>
               <w:rPr>
                 <w:rStyle w:val="SourceText"/>
               </w:rPr>
-              <w:t>api.js</w:t>
-            </w:r>
-            <w:r>
-              <w:rPr/>
-              <w:t xml:space="preserve"> for the three API endpoints and JSON handling, then </w:t>
+              <w:t>src/fieldnotes/api.js</w:t>
+            </w:r>
+            <w:r>
+              <w:rPr>
+                <w:rStyle w:val="Strong"/>
+              </w:rPr>
+              <w:t>.</w:t>
+            </w:r>
+            <w:r>
+              <w:rPr/>
+              <w:t xml:space="preserve"> “The API integration layer uses three Open-Meteo endpoints: Geocoding for place search, Forecast for current and daily weather, and Air Quality for AQI data. In </w:t>
             </w:r>
             <w:r>
               <w:rPr>
                 <w:rStyle w:val="SourceText"/>
               </w:rPr>
-              <w:t>app.js</w:t>
-            </w:r>
-            <w:r>
-              <w:rPr/>
-              <w:t xml:space="preserve"> for rendering, event handling, asynchronous-state protection, and localStorage. </w:t>
+              <w:t>getTripConditions</w:t>
+            </w:r>
+            <w:r>
+              <w:rPr/>
+              <w:t xml:space="preserve">, </w:t>
+            </w:r>
+            <w:r>
+              <w:rPr>
+                <w:rStyle w:val="SourceText"/>
+              </w:rPr>
+              <w:t>Promise.allSettled</w:t>
+            </w:r>
+            <w:r>
+              <w:rPr/>
+              <w:t xml:space="preserve"> starts the forecast and air-quality requests concurrently. I check the forecast result separately: if the forecast fails, the app reports an error; if only air quality fails, the forecast remains available and the AQI is treated as unavailable. The fetch helper also checks HTTP errors and applies a timeout.” </w:t>
             </w:r>
           </w:p>
         </w:tc>
@@ -2106,51 +2234,179 @@
         <w:trPr/>
         <w:tc>
           <w:tcPr>
-            <w:tcW w:w="882" w:type="dxa"/>
-            <w:tcBorders/>
-            <w:vAlign w:val="center"/>
-          </w:tcPr>
-          <w:p>
-            <w:pPr>
-              <w:pStyle w:val="TableContents"/>
-              <w:bidi w:val="0"/>
-              <w:spacing w:before="100" w:after="160"/>
-              <w:jc w:val="start"/>
-              <w:rPr/>
-            </w:pPr>
-            <w:r>
-              <w:rPr/>
-              <w:t>4:25–5:00</w:t>
-            </w:r>
-          </w:p>
-        </w:tc>
-        <w:tc>
-          <w:tcPr>
-            <w:tcW w:w="8950" w:type="dxa"/>
-            <w:tcBorders/>
-            <w:vAlign w:val="center"/>
-          </w:tcPr>
-          <w:p>
-            <w:pPr>
-              <w:pStyle w:val="TableContents"/>
-              <w:bidi w:val="0"/>
-              <w:spacing w:before="100" w:after="160"/>
-              <w:jc w:val="start"/>
-              <w:rPr/>
-            </w:pPr>
-            <w:r>
-              <w:rPr/>
+            <w:tcW w:w="671" w:type="dxa"/>
+            <w:tcBorders/>
+            <w:vAlign w:val="center"/>
+          </w:tcPr>
+          <w:p>
+            <w:pPr>
+              <w:pStyle w:val="TableContents"/>
+              <w:bidi w:val="0"/>
+              <w:spacing w:before="100" w:after="160"/>
+              <w:jc w:val="start"/>
+              <w:rPr/>
+            </w:pPr>
+            <w:r>
+              <w:rPr/>
+              <w:t>3:30–4:20</w:t>
+            </w:r>
+          </w:p>
+        </w:tc>
+        <w:tc>
+          <w:tcPr>
+            <w:tcW w:w="9161" w:type="dxa"/>
+            <w:tcBorders/>
+            <w:vAlign w:val="center"/>
+          </w:tcPr>
+          <w:p>
+            <w:pPr>
+              <w:pStyle w:val="TableContents"/>
+              <w:bidi w:val="0"/>
+              <w:spacing w:before="100" w:after="160"/>
+              <w:jc w:val="start"/>
+              <w:rPr/>
+            </w:pPr>
+            <w:r>
+              <w:rPr>
+                <w:rStyle w:val="Strong"/>
+              </w:rPr>
               <w:t xml:space="preserve">Show </w:t>
             </w:r>
             <w:r>
               <w:rPr>
                 <w:rStyle w:val="SourceText"/>
               </w:rPr>
-              <w:t>styles.css</w:t>
-            </w:r>
-            <w:r>
-              <w:rPr/>
-              <w:t xml:space="preserve"> for responsive and animated details, then close by displaying the live app, source repository, and Fieldnotes Trello board. </w:t>
+              <w:t>src/fieldnotes/app.js</w:t>
+            </w:r>
+            <w:r>
+              <w:rPr>
+                <w:rStyle w:val="Strong"/>
+              </w:rPr>
+              <w:t>.</w:t>
+            </w:r>
+            <w:r>
+              <w:rPr/>
+              <w:t xml:space="preserve"> “This file turns the returned JSON into the interface. The daily arrays are mapped into seven forecast cards, and current and daily data are used for the condition details. The </w:t>
+            </w:r>
+            <w:r>
+              <w:rPr>
+                <w:rStyle w:val="SourceText"/>
+              </w:rPr>
+              <w:t>requestId</w:t>
+            </w:r>
+            <w:r>
+              <w:rPr/>
+              <w:t xml:space="preserve"> protects the page when requests overlap: every new forecast request increments the ID, and after each asynchronous request the code compares its saved ID with the current one. If they differ, that response is stale and is ignored, so an older search cannot overwrite a newer result.” </w:t>
+            </w:r>
+          </w:p>
+        </w:tc>
+      </w:tr>
+      <w:tr>
+        <w:trPr/>
+        <w:tc>
+          <w:tcPr>
+            <w:tcW w:w="671" w:type="dxa"/>
+            <w:tcBorders/>
+            <w:vAlign w:val="center"/>
+          </w:tcPr>
+          <w:p>
+            <w:pPr>
+              <w:pStyle w:val="TableContents"/>
+              <w:bidi w:val="0"/>
+              <w:spacing w:before="100" w:after="160"/>
+              <w:jc w:val="start"/>
+              <w:rPr/>
+            </w:pPr>
+            <w:r>
+              <w:rPr/>
+              <w:t>4:20–4:45</w:t>
+            </w:r>
+          </w:p>
+        </w:tc>
+        <w:tc>
+          <w:tcPr>
+            <w:tcW w:w="9161" w:type="dxa"/>
+            <w:tcBorders/>
+            <w:vAlign w:val="center"/>
+          </w:tcPr>
+          <w:p>
+            <w:pPr>
+              <w:pStyle w:val="TableContents"/>
+              <w:bidi w:val="0"/>
+              <w:spacing w:before="100" w:after="160"/>
+              <w:jc w:val="start"/>
+              <w:rPr/>
+            </w:pPr>
+            <w:r>
+              <w:rPr>
+                <w:rStyle w:val="Strong"/>
+              </w:rPr>
+              <w:t xml:space="preserve">Show </w:t>
+            </w:r>
+            <w:r>
+              <w:rPr>
+                <w:rStyle w:val="SourceText"/>
+              </w:rPr>
+              <w:t>src/fieldnotes/styles.css</w:t>
+            </w:r>
+            <w:r>
+              <w:rPr>
+                <w:rStyle w:val="Strong"/>
+              </w:rPr>
+              <w:t>.</w:t>
+            </w:r>
+            <w:r>
+              <w:rPr/>
+              <w:t xml:space="preserve"> “The CSS provides responsive layouts, light and dark themes, hover and focus feedback, and loading and entrance animations. Reduced-motion preferences are supported for visitors who prefer less animation.” </w:t>
+            </w:r>
+          </w:p>
+        </w:tc>
+      </w:tr>
+      <w:tr>
+        <w:trPr/>
+        <w:tc>
+          <w:tcPr>
+            <w:tcW w:w="671" w:type="dxa"/>
+            <w:tcBorders/>
+            <w:vAlign w:val="center"/>
+          </w:tcPr>
+          <w:p>
+            <w:pPr>
+              <w:pStyle w:val="TableContents"/>
+              <w:bidi w:val="0"/>
+              <w:spacing w:before="100" w:after="160"/>
+              <w:jc w:val="start"/>
+              <w:rPr/>
+            </w:pPr>
+            <w:r>
+              <w:rPr/>
+              <w:t>4:45–5:00</w:t>
+            </w:r>
+          </w:p>
+        </w:tc>
+        <w:tc>
+          <w:tcPr>
+            <w:tcW w:w="9161" w:type="dxa"/>
+            <w:tcBorders/>
+            <w:vAlign w:val="center"/>
+          </w:tcPr>
+          <w:p>
+            <w:pPr>
+              <w:pStyle w:val="TableContents"/>
+              <w:bidi w:val="0"/>
+              <w:spacing w:before="100" w:after="160"/>
+              <w:jc w:val="start"/>
+              <w:rPr/>
+            </w:pPr>
+            <w:r>
+              <w:rPr>
+                <w:rStyle w:val="Strong"/>
+              </w:rPr>
+              <w:t>Show the public Trello board, then close.</w:t>
+            </w:r>
+            <w:r>
+              <w:rPr/>
+              <w:t xml:space="preserve"> “My public Fieldnotes Trello board records the project tasks and links to their evidence. Here are the live app, source repository, and board. Thank you for watching.” </w:t>
             </w:r>
           </w:p>
         </w:tc>
@@ -2166,7 +2422,7 @@
       </w:pPr>
       <w:r>
         <w:rPr/>
-        <w:t xml:space="preserve">Before submitting: publish the recording with public access, test its URL in a private/incognito window, replace the video placeholder in this document, and upload the final document to Canvas. </w:t>
+        <w:t xml:space="preserve">Before submitting: publish the recording with public access, test its URL in a private/incognito window, replace the pending-video note in this document with the direct URL to one video (not a folder), and upload the final document to Canvas. </w:t>
       </w:r>
     </w:p>
     <w:sectPr>

</xml_diff>